<commit_message>
feat: implémentation de l'interface candidat
</commit_message>
<xml_diff>
--- a/remarques rapport.docx
+++ b/remarques rapport.docx
@@ -136,15 +136,13 @@
         <w:t xml:space="preserve"> du titre de la section.</w:t>
       </w:r>
     </w:p>
-    <w:p>
-      <w:bookmarkStart w:id="0" w:name="_GoBack"/>
-      <w:bookmarkEnd w:id="0"/>
-    </w:p>
-    <w:p>
-      <w:pPr>
-        <w:rPr>
-          <w:b/>
-          <w:bCs/>
+    <w:p/>
+    <w:p>
+      <w:pPr>
+        <w:rPr>
+          <w:b/>
+          <w:bCs/>
+          <w:highlight w:val="green"/>
         </w:rPr>
       </w:pPr>
       <w:r>
@@ -153,7 +151,15 @@
           <w:bCs/>
           <w:highlight w:val="yellow"/>
         </w:rPr>
-        <w:t>Remarque 3 – Diagramme Use Case Global</w:t>
+        <w:t>R</w:t>
+      </w:r>
+      <w:r>
+        <w:rPr>
+          <w:b/>
+          <w:bCs/>
+          <w:highlight w:val="green"/>
+        </w:rPr>
+        <w:t>emarque 3 – Diagramme Use Case Global</w:t>
       </w:r>
     </w:p>
     <w:p/>
@@ -302,13 +308,14 @@
         <w:rPr>
           <w:b/>
           <w:bCs/>
-        </w:rPr>
-      </w:pPr>
-      <w:r>
-        <w:rPr>
-          <w:b/>
-          <w:bCs/>
-          <w:highlight w:val="yellow"/>
+          <w:highlight w:val="green"/>
+        </w:rPr>
+      </w:pPr>
+      <w:r>
+        <w:rPr>
+          <w:b/>
+          <w:bCs/>
+          <w:highlight w:val="green"/>
         </w:rPr>
         <w:t>Remarque 4 – Méthodologie</w:t>
       </w:r>
@@ -364,13 +371,14 @@
         <w:rPr>
           <w:b/>
           <w:bCs/>
-        </w:rPr>
-      </w:pPr>
-      <w:r>
-        <w:rPr>
-          <w:b/>
-          <w:bCs/>
-          <w:highlight w:val="yellow"/>
+          <w:highlight w:val="green"/>
+        </w:rPr>
+      </w:pPr>
+      <w:r>
+        <w:rPr>
+          <w:b/>
+          <w:bCs/>
+          <w:highlight w:val="green"/>
         </w:rPr>
         <w:t>Remarque 5 – UML</w:t>
       </w:r>
@@ -378,6 +386,7 @@
         <w:rPr>
           <w:b/>
           <w:bCs/>
+          <w:highlight w:val="green"/>
         </w:rPr>
         <w:tab/>
       </w:r>
@@ -412,7 +421,7 @@
         <w:rPr>
           <w:b/>
           <w:bCs/>
-          <w:highlight w:val="yellow"/>
+          <w:highlight w:val="green"/>
         </w:rPr>
         <w:t>Remarque 6 – Section 1.3.3 Besoins non fonctionnels</w:t>
       </w:r>
@@ -469,27 +478,22 @@
         <w:rPr>
           <w:b/>
           <w:bCs/>
-        </w:rPr>
-      </w:pPr>
-      <w:r>
-        <w:rPr>
-          <w:b/>
-          <w:bCs/>
-          <w:highlight w:val="yellow"/>
-        </w:rPr>
-        <w:t>Remarque 7 – Introduction et conclusion</w:t>
-      </w:r>
-      <w:r>
-        <w:rPr>
-          <w:b/>
-          <w:bCs/>
-        </w:rPr>
-        <w:t xml:space="preserve"> </w:t>
-      </w:r>
-      <w:r>
-        <w:rPr>
-          <w:b/>
-          <w:bCs/>
+          <w:highlight w:val="green"/>
+        </w:rPr>
+      </w:pPr>
+      <w:r>
+        <w:rPr>
+          <w:b/>
+          <w:bCs/>
+          <w:highlight w:val="green"/>
+        </w:rPr>
+        <w:t xml:space="preserve">Remarque 7 – Introduction et conclusion </w:t>
+      </w:r>
+      <w:r>
+        <w:rPr>
+          <w:b/>
+          <w:bCs/>
+          <w:highlight w:val="green"/>
         </w:rPr>
         <w:tab/>
       </w:r>
@@ -529,6 +533,7 @@
         <w:rPr>
           <w:b/>
           <w:bCs/>
+          <w:highlight w:val="green"/>
         </w:rPr>
         <w:t>Remarque 8 – Diagramme BPMN</w:t>
       </w:r>
@@ -536,6 +541,7 @@
         <w:rPr>
           <w:b/>
           <w:bCs/>
+          <w:highlight w:val="green"/>
         </w:rPr>
         <w:br w:type="textWrapping"/>
       </w:r>
@@ -651,6 +657,7 @@
         <w:rPr>
           <w:b/>
           <w:bCs/>
+          <w:highlight w:val="green"/>
         </w:rPr>
       </w:pPr>
       <w:r>
@@ -690,13 +697,16 @@
         <w:br w:type="textWrapping"/>
       </w:r>
       <w:r>
+        <w:rPr>
+          <w:highlight w:val="green"/>
+        </w:rPr>
         <w:br w:type="textWrapping"/>
       </w:r>
       <w:r>
         <w:rPr>
           <w:b/>
           <w:bCs/>
-          <w:highlight w:val="yellow"/>
+          <w:highlight w:val="green"/>
         </w:rPr>
         <w:t>Remarque 9 – Section 2.2 Critique de l'existant</w:t>
       </w:r>
@@ -708,14 +718,16 @@
     </w:p>
     <w:p/>
     <w:p>
-      <w:r>
-        <w:rPr>
-          <w:highlight w:val="yellow"/>
-        </w:rPr>
-        <w:t>Remarque 10 – Section 2.4 Solutions équivalentes</w:t>
-      </w:r>
-      <w:r>
-        <w:t xml:space="preserve"> </w:t>
+      <w:pPr>
+        <w:rPr>
+          <w:highlight w:val="green"/>
+        </w:rPr>
+      </w:pPr>
+      <w:r>
+        <w:rPr>
+          <w:highlight w:val="green"/>
+        </w:rPr>
+        <w:t xml:space="preserve">Remarque 10 – Section 2.4 Solutions équivalentes </w:t>
       </w:r>
     </w:p>
     <w:p>
@@ -759,50 +771,63 @@
         <w:rPr>
           <w:b/>
           <w:bCs/>
-          <w:highlight w:val="yellow"/>
-        </w:rPr>
-        <w:t>Remarque 11 – Section 3.1.1 Architecture logique</w:t>
-      </w:r>
-      <w:r>
-        <w:rPr>
-          <w:b/>
-          <w:bCs/>
-        </w:rPr>
-        <w:t xml:space="preserve"> </w:t>
-      </w:r>
-    </w:p>
-    <w:p>
-      <w:r>
+          <w:highlight w:val="green"/>
+        </w:rPr>
+        <w:t xml:space="preserve">Remarque 11 – Section 3.1.1 Architecture logique </w:t>
+      </w:r>
+    </w:p>
+    <w:p>
+      <w:pPr>
+        <w:rPr>
+          <w:highlight w:val="green"/>
+        </w:rPr>
+      </w:pPr>
+      <w:r>
+        <w:rPr>
+          <w:highlight w:val="green"/>
+        </w:rPr>
         <w:t>Annoncer clairement l'</w:t>
       </w:r>
       <w:r>
         <w:rPr>
           <w:b/>
           <w:bCs/>
+          <w:highlight w:val="green"/>
         </w:rPr>
         <w:t>architecture utilisée</w:t>
       </w:r>
       <w:r>
+        <w:rPr>
+          <w:highlight w:val="green"/>
+        </w:rPr>
         <w:t xml:space="preserve"> : exemple </w:t>
       </w:r>
       <w:r>
         <w:rPr>
           <w:b/>
           <w:bCs/>
+          <w:highlight w:val="green"/>
         </w:rPr>
         <w:t>MVC</w:t>
       </w:r>
       <w:r>
+        <w:rPr>
+          <w:highlight w:val="green"/>
+        </w:rPr>
         <w:t xml:space="preserve"> pour Spring Boot et </w:t>
       </w:r>
       <w:r>
         <w:rPr>
           <w:b/>
           <w:bCs/>
+          <w:highlight w:val="green"/>
         </w:rPr>
         <w:t>MVVM</w:t>
       </w:r>
       <w:r>
+        <w:rPr>
+          <w:highlight w:val="green"/>
+        </w:rPr>
         <w:t xml:space="preserve"> pour Angular. </w:t>
       </w:r>
     </w:p>
@@ -883,177 +908,188 @@
         </w:drawing>
       </w:r>
     </w:p>
-    <w:p/>
-    <w:p>
-      <w:pPr>
-        <w:rPr>
-          <w:b/>
-          <w:bCs/>
-        </w:rPr>
-      </w:pPr>
+    <w:p>
+      <w:pPr>
+        <w:rPr>
+          <w:highlight w:val="green"/>
+        </w:rPr>
+      </w:pPr>
+    </w:p>
+    <w:p>
+      <w:pPr>
+        <w:rPr>
+          <w:b/>
+          <w:bCs/>
+        </w:rPr>
+      </w:pPr>
+      <w:r>
+        <w:rPr>
+          <w:b/>
+          <w:bCs/>
+          <w:highlight w:val="green"/>
+        </w:rPr>
+        <w:t>Remarque 12 – Section 3.2.1</w:t>
+      </w:r>
+      <w:r>
+        <w:rPr>
+          <w:b/>
+          <w:bCs/>
+          <w:highlight w:val="green"/>
+        </w:rPr>
+        <w:tab/>
+      </w:r>
+      <w:r>
+        <w:rPr>
+          <w:b/>
+          <w:bCs/>
+        </w:rPr>
+        <w:t xml:space="preserve"> 3.2.1 Cas d’utilisation de l’Administrateur</w:t>
+      </w:r>
+    </w:p>
+    <w:p>
+      <w:pPr>
+        <w:rPr>
+          <w:b/>
+          <w:bCs/>
+        </w:rPr>
+      </w:pPr>
+      <w:r>
+        <w:t xml:space="preserve">Ajouter le mot </w:t>
+      </w:r>
+      <w:r>
+        <w:rPr>
+          <w:b/>
+          <w:bCs/>
+        </w:rPr>
+        <w:t>« Diagramme »</w:t>
+      </w:r>
+      <w:r>
+        <w:t xml:space="preserve"> dans le titre → </w:t>
+      </w:r>
+      <w:r>
+        <w:rPr>
+          <w:b/>
+          <w:bCs/>
+        </w:rPr>
+        <w:t>Diagramme de cas d'utilisation de l'Administrateur</w:t>
+      </w:r>
+      <w:r>
+        <w:t>.</w:t>
+      </w:r>
+    </w:p>
+    <w:p>
+      <w:pPr>
+        <w:rPr>
+          <w:b/>
+          <w:bCs/>
+          <w:highlight w:val="green"/>
+        </w:rPr>
+      </w:pPr>
+      <w:r>
+        <w:rPr>
+          <w:b/>
+          <w:bCs/>
+          <w:highlight w:val="green"/>
+        </w:rPr>
+        <w:t>Remarque 13 – Section 3.2 Use Cases raffinés</w:t>
+      </w:r>
+    </w:p>
+    <w:p>
+      <w:r>
+        <w:t>Ajouter un tableau descriptif contenant : scénario principal, scénario alternatif, déclencheur.</w:t>
+      </w:r>
+    </w:p>
+    <w:p>
+      <w:r>
+        <w:t>Choisir 1 seul Use Case par acteur et le mettre dans un tableau.</w:t>
+      </w:r>
+    </w:p>
+    <w:p>
+      <w:pPr>
+        <w:rPr>
+          <w:b/>
+          <w:bCs/>
+          <w:highlight w:val="green"/>
+        </w:rPr>
+      </w:pPr>
+      <w:r>
+        <w:rPr>
+          <w:b/>
+          <w:bCs/>
+          <w:highlight w:val="green"/>
+        </w:rPr>
+        <w:t>Remarque 14 – Diagramme de classes</w:t>
+      </w:r>
+    </w:p>
+    <w:p>
+      <w:r>
+        <w:t xml:space="preserve">Ajouter le </w:t>
+      </w:r>
+      <w:r>
+        <w:rPr>
+          <w:b/>
+          <w:bCs/>
+        </w:rPr>
+        <w:t>diagramme de classes</w:t>
+      </w:r>
+      <w:r>
+        <w:t xml:space="preserve"> pour validation par l'encadreur.</w:t>
+      </w:r>
+    </w:p>
+    <w:p>
+      <w:pPr>
+        <w:rPr>
+          <w:b/>
+          <w:bCs/>
+        </w:rPr>
+      </w:pPr>
+      <w:r>
+        <w:rPr>
+          <w:b/>
+          <w:bCs/>
+          <w:highlight w:val="green"/>
+        </w:rPr>
+        <w:t>Remarque 15 – Section 3.5</w:t>
+      </w:r>
+      <w:r>
+        <w:rPr>
+          <w:b/>
+          <w:bCs/>
+        </w:rPr>
+        <w:t xml:space="preserve">Conception détaillée </w:t>
+      </w:r>
+    </w:p>
+    <w:p>
+      <w:pPr>
+        <w:rPr>
+          <w:rFonts w:hint="default"/>
+          <w:b/>
+          <w:bCs/>
+          <w:lang w:val="fr-FR"/>
+        </w:rPr>
+      </w:pPr>
+      <w:r>
+        <w:rPr>
+          <w:b/>
+          <w:bCs/>
+        </w:rPr>
+        <w:t>Supprimer la section 3.5</w:t>
+      </w:r>
+      <w:r>
+        <w:t xml:space="preserve"> car elle n'existe pas dans le plan du rapport.</w:t>
+      </w:r>
+      <w:r>
+        <w:br w:type="textWrapping"/>
+      </w:r>
+      <w:r>
+        <w:br w:type="textWrapping"/>
+      </w:r>
       <w:r>
         <w:rPr>
           <w:b/>
           <w:bCs/>
           <w:highlight w:val="yellow"/>
         </w:rPr>
-        <w:t>Remarque 12 – Section 3.2.1</w:t>
-      </w:r>
-      <w:r>
-        <w:rPr>
-          <w:b/>
-          <w:bCs/>
-        </w:rPr>
-        <w:tab/>
-      </w:r>
-      <w:r>
-        <w:rPr>
-          <w:b/>
-          <w:bCs/>
-        </w:rPr>
-        <w:t xml:space="preserve"> 3.2.1 Cas d’utilisation de l’Administrateur</w:t>
-      </w:r>
-    </w:p>
-    <w:p>
-      <w:pPr>
-        <w:rPr>
-          <w:b/>
-          <w:bCs/>
-        </w:rPr>
-      </w:pPr>
-      <w:r>
-        <w:t xml:space="preserve">Ajouter le mot </w:t>
-      </w:r>
-      <w:r>
-        <w:rPr>
-          <w:b/>
-          <w:bCs/>
-        </w:rPr>
-        <w:t>« Diagramme »</w:t>
-      </w:r>
-      <w:r>
-        <w:t xml:space="preserve"> dans le titre → </w:t>
-      </w:r>
-      <w:r>
-        <w:rPr>
-          <w:b/>
-          <w:bCs/>
-        </w:rPr>
-        <w:t>Diagramme de cas d'utilisation de l'Administrateur</w:t>
-      </w:r>
-      <w:r>
-        <w:t>.</w:t>
-      </w:r>
-    </w:p>
-    <w:p>
-      <w:pPr>
-        <w:rPr>
-          <w:b/>
-          <w:bCs/>
-        </w:rPr>
-      </w:pPr>
-      <w:r>
-        <w:rPr>
-          <w:b/>
-          <w:bCs/>
-          <w:highlight w:val="yellow"/>
-        </w:rPr>
-        <w:t>Remarque 13 – Section 3.2 Use Cases raffinés</w:t>
-      </w:r>
-    </w:p>
-    <w:p>
-      <w:r>
-        <w:t>Ajouter un tableau descriptif contenant : scénario principal, scénario alternatif, déclencheur.</w:t>
-      </w:r>
-    </w:p>
-    <w:p>
-      <w:r>
-        <w:t>Choisir 1 seul Use Case par acteur et le mettre dans un tableau.</w:t>
-      </w:r>
-    </w:p>
-    <w:p>
-      <w:pPr>
-        <w:rPr>
-          <w:b/>
-          <w:bCs/>
-        </w:rPr>
-      </w:pPr>
-      <w:r>
-        <w:rPr>
-          <w:b/>
-          <w:bCs/>
-          <w:highlight w:val="yellow"/>
-        </w:rPr>
-        <w:t>Remarque 14 – Diagramme de classes</w:t>
-      </w:r>
-    </w:p>
-    <w:p>
-      <w:r>
-        <w:t xml:space="preserve">Ajouter le </w:t>
-      </w:r>
-      <w:r>
-        <w:rPr>
-          <w:b/>
-          <w:bCs/>
-        </w:rPr>
-        <w:t>diagramme de classes</w:t>
-      </w:r>
-      <w:r>
-        <w:t xml:space="preserve"> pour validation par l'encadreur.</w:t>
-      </w:r>
-    </w:p>
-    <w:p>
-      <w:pPr>
-        <w:rPr>
-          <w:b/>
-          <w:bCs/>
-        </w:rPr>
-      </w:pPr>
-      <w:r>
-        <w:rPr>
-          <w:b/>
-          <w:bCs/>
-          <w:highlight w:val="yellow"/>
-        </w:rPr>
-        <w:t>Remarque 15 – Section 3.5</w:t>
-      </w:r>
-      <w:r>
-        <w:rPr>
-          <w:b/>
-          <w:bCs/>
-        </w:rPr>
-        <w:t xml:space="preserve">Conception détaillée </w:t>
-      </w:r>
-    </w:p>
-    <w:p>
-      <w:pPr>
-        <w:rPr>
-          <w:b/>
-          <w:bCs/>
-        </w:rPr>
-      </w:pPr>
-      <w:r>
-        <w:rPr>
-          <w:b/>
-          <w:bCs/>
-        </w:rPr>
-        <w:t>Supprimer la section 3.5</w:t>
-      </w:r>
-      <w:r>
-        <w:t xml:space="preserve"> car elle n'existe pas dans le plan du rapport.</w:t>
-      </w:r>
-      <w:r>
-        <w:br w:type="textWrapping"/>
-      </w:r>
-      <w:r>
-        <w:br w:type="textWrapping"/>
-      </w:r>
-      <w:r>
-        <w:rPr>
-          <w:b/>
-          <w:bCs/>
-          <w:highlight w:val="yellow"/>
-        </w:rPr>
         <w:t>16</w:t>
       </w:r>
       <w:r>
@@ -1062,6 +1098,15 @@
           <w:bCs/>
         </w:rPr>
         <w:t xml:space="preserve"> diagramme de séquence</w:t>
+      </w:r>
+      <w:r>
+        <w:rPr>
+          <w:rFonts w:hint="default"/>
+          <w:b/>
+          <w:bCs/>
+          <w:lang w:val="fr-FR"/>
+        </w:rPr>
+        <w:t xml:space="preserve">  : chanque acteur diagramme </w:t>
       </w:r>
     </w:p>
     <w:p>
@@ -1670,17 +1715,20 @@
         <w:rPr>
           <w:b/>
           <w:bCs/>
-        </w:rPr>
-      </w:pPr>
-      <w:r>
-        <w:rPr>
-          <w:b/>
-          <w:bCs/>
-          <w:highlight w:val="yellow"/>
+          <w:highlight w:val="green"/>
+        </w:rPr>
+      </w:pPr>
+      <w:bookmarkStart w:id="0" w:name="_GoBack"/>
+      <w:r>
+        <w:rPr>
+          <w:b/>
+          <w:bCs/>
+          <w:highlight w:val="green"/>
         </w:rPr>
         <w:t>Remarque 17 – Architecture physique</w:t>
       </w:r>
     </w:p>
+    <w:bookmarkEnd w:id="0"/>
     <w:p>
       <w:r>
         <w:rPr>
@@ -2301,6 +2349,7 @@
     <w:basedOn w:val="11"/>
     <w:link w:val="8"/>
     <w:semiHidden/>
+    <w:qFormat/>
     <w:uiPriority w:val="9"/>
     <w:rPr>
       <w:rFonts w:eastAsiaTheme="majorEastAsia" w:cstheme="majorBidi"/>
@@ -2360,6 +2409,7 @@
     <w:name w:val="Titre Car"/>
     <w:basedOn w:val="11"/>
     <w:link w:val="15"/>
+    <w:qFormat/>
     <w:uiPriority w:val="10"/>
     <w:rPr>
       <w:rFonts w:asciiTheme="majorHAnsi" w:hAnsiTheme="majorHAnsi" w:eastAsiaTheme="majorEastAsia" w:cstheme="majorBidi"/>
@@ -2483,6 +2533,7 @@
     <w:name w:val="Citation intense Car"/>
     <w:basedOn w:val="11"/>
     <w:link w:val="32"/>
+    <w:qFormat/>
     <w:uiPriority w:val="30"/>
     <w:rPr>
       <w:i/>

</xml_diff>